<commit_message>
"Agrega mensaje de Consola e Informe entregable"
</commit_message>
<xml_diff>
--- a/Introduccion a Devops Taller 1/Taller 1 Introduccion a Devops.docx
+++ b/Introduccion a Devops Taller 1/Taller 1 Introduccion a Devops.docx
@@ -275,15 +275,7 @@
           <w:sz w:val="32"/>
           <w:szCs w:val="28"/>
         </w:rPr>
-        <w:t>3</w:t>
-      </w:r>
-      <w:r>
-        <w:rPr>
-          <w:color w:val="000000" w:themeColor="text1"/>
-          <w:sz w:val="32"/>
-          <w:szCs w:val="28"/>
-        </w:rPr>
-        <w:t>)</w:t>
+        <w:t>3)</w:t>
       </w:r>
     </w:p>
     <w:p>
@@ -331,7 +323,25 @@
           <w:sz w:val="32"/>
           <w:szCs w:val="28"/>
         </w:rPr>
-        <w:t>Introducción A Devops Y Control De Versiones</w:t>
+        <w:t xml:space="preserve">Introducción A </w:t>
+      </w:r>
+      <w:proofErr w:type="spellStart"/>
+      <w:r>
+        <w:rPr>
+          <w:color w:val="000000" w:themeColor="text1"/>
+          <w:sz w:val="32"/>
+          <w:szCs w:val="28"/>
+        </w:rPr>
+        <w:t>Devops</w:t>
+      </w:r>
+      <w:proofErr w:type="spellEnd"/>
+      <w:r>
+        <w:rPr>
+          <w:color w:val="000000" w:themeColor="text1"/>
+          <w:sz w:val="32"/>
+          <w:szCs w:val="28"/>
+        </w:rPr>
+        <w:t xml:space="preserve"> Y Control De Versiones</w:t>
       </w:r>
       <w:r>
         <w:rPr>
@@ -428,7 +438,15 @@
           <w:sz w:val="32"/>
           <w:szCs w:val="28"/>
         </w:rPr>
-        <w:t>22</w:t>
+        <w:t>2</w:t>
+      </w:r>
+      <w:r>
+        <w:rPr>
+          <w:color w:val="000000" w:themeColor="text1"/>
+          <w:sz w:val="32"/>
+          <w:szCs w:val="28"/>
+        </w:rPr>
+        <w:t>3</w:t>
       </w:r>
       <w:r>
         <w:rPr>
@@ -521,8 +539,64 @@
           <w:lang w:val="es-419"/>
         </w:rPr>
         <w:lastRenderedPageBreak/>
-        <w:t xml:space="preserve">Los commits se dividieron de la siguiente forma: </w:t>
+        <w:t xml:space="preserve">Los </w:t>
       </w:r>
+      <w:proofErr w:type="spellStart"/>
+      <w:r>
+        <w:rPr>
+          <w:color w:val="000000" w:themeColor="text1"/>
+          <w:lang w:val="es-419"/>
+        </w:rPr>
+        <w:t>commits</w:t>
+      </w:r>
+      <w:proofErr w:type="spellEnd"/>
+      <w:r>
+        <w:rPr>
+          <w:color w:val="000000" w:themeColor="text1"/>
+          <w:lang w:val="es-419"/>
+        </w:rPr>
+        <w:t xml:space="preserve"> se dividieron de la siguiente forma: </w:t>
+      </w:r>
+    </w:p>
+    <w:p>
+      <w:pPr>
+        <w:rPr>
+          <w:color w:val="000000" w:themeColor="text1"/>
+          <w:lang w:val="es-419"/>
+        </w:rPr>
+      </w:pPr>
+      <w:r>
+        <w:rPr>
+          <w:color w:val="000000" w:themeColor="text1"/>
+          <w:lang w:val="es-419"/>
+        </w:rPr>
+        <w:t xml:space="preserve">El link del repositorio es: </w:t>
+      </w:r>
+    </w:p>
+    <w:p>
+      <w:pPr>
+        <w:rPr>
+          <w:color w:val="000000" w:themeColor="text1"/>
+          <w:lang w:val="es-419"/>
+        </w:rPr>
+      </w:pPr>
+      <w:hyperlink r:id="rId8" w:history="1">
+        <w:r>
+          <w:rPr>
+            <w:rStyle w:val="Hipervnculo"/>
+            <w:lang w:val="es-419"/>
+          </w:rPr>
+          <w:t>https://github.com/HancelE93/TalleresJava/tree/main/Introduccion%20a%20Devops%20Taller%201</w:t>
+        </w:r>
+      </w:hyperlink>
+    </w:p>
+    <w:p>
+      <w:pPr>
+        <w:rPr>
+          <w:color w:val="000000" w:themeColor="text1"/>
+          <w:lang w:val="es-419"/>
+        </w:rPr>
+      </w:pPr>
     </w:p>
     <w:p>
       <w:pPr>
@@ -552,7 +626,7 @@
                     <pic:cNvPicPr/>
                   </pic:nvPicPr>
                   <pic:blipFill>
-                    <a:blip r:embed="rId8"/>
+                    <a:blip r:embed="rId9"/>
                     <a:stretch>
                       <a:fillRect/>
                     </a:stretch>
@@ -601,7 +675,7 @@
                     <pic:cNvPicPr/>
                   </pic:nvPicPr>
                   <pic:blipFill rotWithShape="1">
-                    <a:blip r:embed="rId9"/>
+                    <a:blip r:embed="rId10"/>
                     <a:srcRect t="6991"/>
                     <a:stretch>
                       <a:fillRect/>
@@ -643,6 +717,7 @@
         <w:rPr>
           <w:noProof/>
         </w:rPr>
+        <w:lastRenderedPageBreak/>
         <w:drawing>
           <wp:inline distT="0" distB="0" distL="0" distR="0" wp14:anchorId="137815BC" wp14:editId="2D036D17">
             <wp:extent cx="5490210" cy="963295"/>
@@ -659,7 +734,7 @@
                     <pic:cNvPicPr/>
                   </pic:nvPicPr>
                   <pic:blipFill>
-                    <a:blip r:embed="rId10"/>
+                    <a:blip r:embed="rId11"/>
                     <a:stretch>
                       <a:fillRect/>
                     </a:stretch>
@@ -680,8 +755,82 @@
         </w:drawing>
       </w:r>
     </w:p>
+    <w:p>
+      <w:pPr>
+        <w:jc w:val="both"/>
+        <w:rPr>
+          <w:color w:val="000000" w:themeColor="text1"/>
+          <w:lang w:val="es-419"/>
+        </w:rPr>
+      </w:pPr>
+    </w:p>
+    <w:p>
+      <w:pPr>
+        <w:jc w:val="both"/>
+        <w:rPr>
+          <w:color w:val="000000" w:themeColor="text1"/>
+          <w:lang w:val="es-419"/>
+        </w:rPr>
+      </w:pPr>
+      <w:r>
+        <w:rPr>
+          <w:color w:val="000000" w:themeColor="text1"/>
+          <w:lang w:val="es-419"/>
+        </w:rPr>
+        <w:t xml:space="preserve">Salida en consola: </w:t>
+      </w:r>
+    </w:p>
+    <w:p>
+      <w:pPr>
+        <w:jc w:val="both"/>
+        <w:rPr>
+          <w:color w:val="000000" w:themeColor="text1"/>
+          <w:lang w:val="es-419"/>
+        </w:rPr>
+      </w:pPr>
+      <w:r>
+        <w:rPr>
+          <w:noProof/>
+        </w:rPr>
+        <w:drawing>
+          <wp:inline distT="0" distB="0" distL="0" distR="0" wp14:anchorId="68B28AE5" wp14:editId="61B3294C">
+            <wp:extent cx="5490210" cy="3605530"/>
+            <wp:effectExtent l="0" t="0" r="0" b="0"/>
+            <wp:docPr id="2053194251" name="Imagen 1"/>
+            <wp:cNvGraphicFramePr>
+              <a:graphicFrameLocks xmlns:a="http://schemas.openxmlformats.org/drawingml/2006/main" noChangeAspect="1"/>
+            </wp:cNvGraphicFramePr>
+            <a:graphic xmlns:a="http://schemas.openxmlformats.org/drawingml/2006/main">
+              <a:graphicData uri="http://schemas.openxmlformats.org/drawingml/2006/picture">
+                <pic:pic xmlns:pic="http://schemas.openxmlformats.org/drawingml/2006/picture">
+                  <pic:nvPicPr>
+                    <pic:cNvPr id="2053194251" name=""/>
+                    <pic:cNvPicPr/>
+                  </pic:nvPicPr>
+                  <pic:blipFill>
+                    <a:blip r:embed="rId12"/>
+                    <a:stretch>
+                      <a:fillRect/>
+                    </a:stretch>
+                  </pic:blipFill>
+                  <pic:spPr>
+                    <a:xfrm>
+                      <a:off x="0" y="0"/>
+                      <a:ext cx="5490210" cy="3605530"/>
+                    </a:xfrm>
+                    <a:prstGeom prst="rect">
+                      <a:avLst/>
+                    </a:prstGeom>
+                  </pic:spPr>
+                </pic:pic>
+              </a:graphicData>
+            </a:graphic>
+          </wp:inline>
+        </w:drawing>
+      </w:r>
+    </w:p>
     <w:sectPr>
-      <w:headerReference w:type="default" r:id="rId11"/>
+      <w:headerReference w:type="default" r:id="rId13"/>
       <w:pgSz w:w="12240" w:h="15840"/>
       <w:pgMar w:top="1440" w:right="1797" w:bottom="1134" w:left="1797" w:header="340" w:footer="0" w:gutter="0"/>
       <w:cols w:space="720"/>
@@ -1805,6 +1954,7 @@
   <w:style w:type="character" w:default="1" w:styleId="Fuentedeprrafopredeter">
     <w:name w:val="Default Paragraph Font"/>
     <w:uiPriority w:val="1"/>
+    <w:semiHidden/>
     <w:unhideWhenUsed/>
   </w:style>
   <w:style w:type="table" w:default="1" w:styleId="Tablanormal">

</xml_diff>